<commit_message>
Deploy preview for PR 107 🛫
</commit_message>
<xml_diff>
--- a/pr-preview/pr-107/chapters/15-outcome-regression-propensity-scores-tracked-changes.docx
+++ b/pr-preview/pr-107/chapters/15-outcome-regression-propensity-scores-tracked-changes.docx
@@ -19808,22 +19808,17 @@
       </m:oMath>
       <w:ins w:id="72" w:author="PR Preview" w:date="2024-01-01T00:00:00Z">
         <w:r>
+          <w:t xml:space="preserve">,</w:t>
+        </w:r>
+      </w:ins>
+      <w:ins w:id="72" w:author="PR Preview" w:date="2024-01-01T00:00:00Z">
+        <w:r>
           <w:t xml:space="preserve"> </w:t>
         </w:r>
       </w:ins>
       <w:ins w:id="72" w:author="PR Preview" w:date="2024-01-01T00:00:00Z">
         <w:r>
-          <w:t xml:space="preserve">and a correctly specified propensity model,</w:t>
-        </w:r>
-      </w:ins>
-      <w:ins w:id="72" w:author="PR Preview" w:date="2024-01-01T00:00:00Z">
-        <w:r>
-          <w:t xml:space="preserve"> </w:t>
-        </w:r>
-      </w:ins>
-      <w:ins w:id="72" w:author="PR Preview" w:date="2024-01-01T00:00:00Z">
-        <w:r>
-          <w:t xml:space="preserve">exact matching on</w:t>
+          <w:t xml:space="preserve">exact matching on the true</w:t>
         </w:r>
       </w:ins>
       <w:ins w:id="72" w:author="PR Preview" w:date="2024-01-01T00:00:00Z">
@@ -19868,7 +19863,7 @@
       </w:ins>
       <w:ins w:id="72" w:author="PR Preview" w:date="2024-01-01T00:00:00Z">
         <w:r>
-          <w:t xml:space="preserve">so, under consistency, association measures in the matched population consistently estimate the effect measures</w:t>
+          <w:t xml:space="preserve">so, under consistency, association measures in the matched population equal the effect measures</w:t>
         </w:r>
       </w:ins>
       <w:ins w:id="72" w:author="PR Preview" w:date="2024-01-01T00:00:00Z">
@@ -19901,7 +19896,7 @@
       </w:pPr>
       <w:ins w:id="73" w:author="PR Preview" w:date="2024-01-01T00:00:00Z">
         <w:r>
-          <w:t xml:space="preserve">Caliper matching makes them only approximately exchangeable:</w:t>
+          <w:t xml:space="preserve">In practice we match on an estimate</w:t>
         </w:r>
       </w:ins>
       <w:ins w:id="73" w:author="PR Preview" w:date="2024-01-01T00:00:00Z">
@@ -19909,9 +19904,90 @@
           <w:t xml:space="preserve"> </w:t>
         </w:r>
       </w:ins>
+      <m:oMath>
+        <m:acc>
+          <m:accPr>
+            <m:chr m:val="̂"/>
+          </m:accPr>
+          <m:e>
+            <m:r>
+              <m:t>π</m:t>
+            </m:r>
+          </m:e>
+        </m:acc>
+        <m:r>
+          <m:rPr>
+            <m:sty m:val="p"/>
+          </m:rPr>
+          <m:t>(</m:t>
+        </m:r>
+        <m:r>
+          <m:t>L</m:t>
+        </m:r>
+        <m:r>
+          <m:rPr>
+            <m:sty m:val="p"/>
+          </m:rPr>
+          <m:t>)</m:t>
+        </m:r>
+      </m:oMath>
       <w:ins w:id="73" w:author="PR Preview" w:date="2024-01-01T00:00:00Z">
         <w:r>
-          <w:t xml:space="preserve">some bias remains, and it shrinks as the caliper narrows.</w:t>
+          <w:t xml:space="preserve">.</w:t>
+        </w:r>
+      </w:ins>
+      <w:ins w:id="73" w:author="PR Preview" w:date="2024-01-01T00:00:00Z">
+        <w:r>
+          <w:t xml:space="preserve"> </w:t>
+        </w:r>
+      </w:ins>
+      <w:ins w:id="73" w:author="PR Preview" w:date="2024-01-01T00:00:00Z">
+        <w:r>
+          <w:t xml:space="preserve">Equal estimated scores need not mean equal true scores,</w:t>
+        </w:r>
+      </w:ins>
+      <w:ins w:id="73" w:author="PR Preview" w:date="2024-01-01T00:00:00Z">
+        <w:r>
+          <w:t xml:space="preserve"> </w:t>
+        </w:r>
+      </w:ins>
+      <w:ins w:id="73" w:author="PR Preview" w:date="2024-01-01T00:00:00Z">
+        <w:r>
+          <w:t xml:space="preserve">so even with a correctly specified propensity model this exchangeability holds only approximately,</w:t>
+        </w:r>
+      </w:ins>
+      <w:ins w:id="73" w:author="PR Preview" w:date="2024-01-01T00:00:00Z">
+        <w:r>
+          <w:t xml:space="preserve"> </w:t>
+        </w:r>
+      </w:ins>
+      <w:ins w:id="73" w:author="PR Preview" w:date="2024-01-01T00:00:00Z">
+        <w:r>
+          <w:t xml:space="preserve">with the approximation improving as the sample grows.</w:t>
+        </w:r>
+      </w:ins>
+    </w:p>
+    <w:p>
+      <w:pPr>
+        <w:pStyle w:val="Compact"/>
+        <w:numPr>
+          <w:ilvl w:val="0"/>
+          <w:numId w:val="1011"/>
+        </w:numPr>
+      </w:pPr>
+      <w:ins w:id="74" w:author="PR Preview" w:date="2024-01-01T00:00:00Z">
+        <w:r>
+          <w:t xml:space="preserve">Caliper matching adds a second approximation:</w:t>
+        </w:r>
+      </w:ins>
+      <w:ins w:id="74" w:author="PR Preview" w:date="2024-01-01T00:00:00Z">
+        <w:r>
+          <w:t xml:space="preserve"> </w:t>
+        </w:r>
+      </w:ins>
+      <w:ins w:id="74" w:author="PR Preview" w:date="2024-01-01T00:00:00Z">
+        <w:r>
+          <w:t xml:space="preserve">some bias may remain, and it typically shrinks as the caliper narrows.</w:t>
         </w:r>
       </w:ins>
     </w:p>
@@ -20218,7 +20294,7 @@
       </w:tr>
     </w:tbl>
     <w:p>
-      <w:ins w:id="1077" w:author="PR Preview" w:date="2024-01-01T00:00:00Z">
+      <w:ins w:id="1078" w:author="PR Preview" w:date="2024-01-01T00:00:00Z">
         <w:r>
           <w:pict>
             <v:rect style="width:0;height:1.5pt" o:hralign="center" o:hrstd="t" o:hr="t"/>
@@ -20754,7 +20830,7 @@
       <w:pPr>
         <w:pStyle w:val="FirstParagraph"/>
       </w:pPr>
-      <w:ins w:id="82" w:author="PR Preview" w:date="2024-01-01T00:00:00Z">
+      <w:ins w:id="83" w:author="PR Preview" w:date="2024-01-01T00:00:00Z">
         <w:r>
           <w:t xml:space="preserve"> </w:t>
         </w:r>
@@ -21034,7 +21110,7 @@
       <w:pPr>
         <w:pStyle w:val="FirstParagraph"/>
       </w:pPr>
-      <w:ins w:id="86" w:author="PR Preview" w:date="2024-01-01T00:00:00Z">
+      <w:ins w:id="87" w:author="PR Preview" w:date="2024-01-01T00:00:00Z">
         <w:r>
           <w:t xml:space="preserve"> </w:t>
         </w:r>
@@ -21827,7 +21903,7 @@
       <w:pPr>
         <w:pStyle w:val="FirstParagraph"/>
       </w:pPr>
-      <w:ins w:id="1092" w:author="PR Preview" w:date="2024-01-01T00:00:00Z">
+      <w:ins w:id="1093" w:author="PR Preview" w:date="2024-01-01T00:00:00Z">
         <w:r>
           <w:t xml:space="preserve"> </w:t>
         </w:r>
@@ -22717,7 +22793,7 @@
       <w:pPr>
         <w:pStyle w:val="FirstParagraph"/>
       </w:pPr>
-      <w:ins w:id="101" w:author="PR Preview" w:date="2024-01-01T00:00:00Z">
+      <w:ins w:id="102" w:author="PR Preview" w:date="2024-01-01T00:00:00Z">
         <w:r>
           <w:t xml:space="preserve"> </w:t>
         </w:r>
@@ -23497,7 +23573,7 @@
       <w:pPr>
         <w:pStyle w:val="FirstParagraph"/>
       </w:pPr>
-      <w:ins w:id="107" w:author="PR Preview" w:date="2024-01-01T00:00:00Z">
+      <w:ins w:id="108" w:author="PR Preview" w:date="2024-01-01T00:00:00Z">
         <w:r>
           <w:t xml:space="preserve"> </w:t>
         </w:r>
@@ -24242,7 +24318,7 @@
       <w:pPr>
         <w:pStyle w:val="BodyText"/>
       </w:pPr>
-      <w:ins w:id="110" w:author="PR Preview" w:date="2024-01-01T00:00:00Z">
+      <w:ins w:id="111" w:author="PR Preview" w:date="2024-01-01T00:00:00Z">
         <w:r>
           <w:t xml:space="preserve"> </w:t>
         </w:r>
@@ -24382,7 +24458,7 @@
           <w:numId w:val="1025"/>
         </w:numPr>
       </w:pPr>
-      <w:ins w:id="112" w:author="PR Preview" w:date="2024-01-01T00:00:00Z">
+      <w:ins w:id="113" w:author="PR Preview" w:date="2024-01-01T00:00:00Z">
         <w:r>
           <w:t xml:space="preserve">Outcome regression and propensity score methods need the same identifying conditions as the g-methods, plus correct models for their nuisance parameters (</w:t>
         </w:r>
@@ -24395,7 +24471,7 @@
           <w:t xml:space="preserve">Definition 2</w:t>
         </w:r>
       </w:hyperlink>
-      <w:ins w:id="112" w:author="PR Preview" w:date="2024-01-01T00:00:00Z">
+      <w:ins w:id="113" w:author="PR Preview" w:date="2024-01-01T00:00:00Z">
         <w:r>
           <w:t xml:space="preserve">).</w:t>
         </w:r>
@@ -24498,27 +24574,27 @@
       <w:pPr>
         <w:pStyle w:val="Bibliography"/>
       </w:pPr>
-      <w:ins w:id="1118" w:author="PR Preview" w:date="2024-01-01T00:00:00Z">
+      <w:ins w:id="1119" w:author="PR Preview" w:date="2024-01-01T00:00:00Z">
         <w:r>
           <w:t xml:space="preserve">Rosenbaum, Paul R, and Donald B Rubin. 1983.</w:t>
         </w:r>
       </w:ins>
-      <w:ins w:id="1118" w:author="PR Preview" w:date="2024-01-01T00:00:00Z">
+      <w:ins w:id="1119" w:author="PR Preview" w:date="2024-01-01T00:00:00Z">
         <w:r>
           <w:t xml:space="preserve"> </w:t>
         </w:r>
       </w:ins>
-      <w:ins w:id="1118" w:author="PR Preview" w:date="2024-01-01T00:00:00Z">
+      <w:ins w:id="1119" w:author="PR Preview" w:date="2024-01-01T00:00:00Z">
         <w:r>
           <w:t xml:space="preserve">“The Central Role of the Propensity Score in Observational Studies for Causal Effects.”</w:t>
         </w:r>
       </w:ins>
-      <w:ins w:id="1118" w:author="PR Preview" w:date="2024-01-01T00:00:00Z">
+      <w:ins w:id="1119" w:author="PR Preview" w:date="2024-01-01T00:00:00Z">
         <w:r>
           <w:t xml:space="preserve"> </w:t>
         </w:r>
       </w:ins>
-      <w:ins w:id="1118" w:author="PR Preview" w:date="2024-01-01T00:00:00Z">
+      <w:ins w:id="1119" w:author="PR Preview" w:date="2024-01-01T00:00:00Z">
         <w:r>
           <w:rPr>
             <w:i/>
@@ -24527,17 +24603,17 @@
           <w:t xml:space="preserve">Biometrika</w:t>
         </w:r>
       </w:ins>
-      <w:ins w:id="1118" w:author="PR Preview" w:date="2024-01-01T00:00:00Z">
+      <w:ins w:id="1119" w:author="PR Preview" w:date="2024-01-01T00:00:00Z">
         <w:r>
           <w:t xml:space="preserve"> </w:t>
         </w:r>
       </w:ins>
-      <w:ins w:id="1118" w:author="PR Preview" w:date="2024-01-01T00:00:00Z">
+      <w:ins w:id="1119" w:author="PR Preview" w:date="2024-01-01T00:00:00Z">
         <w:r>
           <w:t xml:space="preserve">70 (1): 41–55.</w:t>
         </w:r>
       </w:ins>
-      <w:ins w:id="1118" w:author="PR Preview" w:date="2024-01-01T00:00:00Z">
+      <w:ins w:id="1119" w:author="PR Preview" w:date="2024-01-01T00:00:00Z">
         <w:r>
           <w:t xml:space="preserve"> </w:t>
         </w:r>
@@ -24550,7 +24626,7 @@
           <w:t xml:space="preserve">https://doi.org/10.1093/biomet/70.1.41</w:t>
         </w:r>
       </w:hyperlink>
-      <w:ins w:id="1118" w:author="PR Preview" w:date="2024-01-01T00:00:00Z">
+      <w:ins w:id="1119" w:author="PR Preview" w:date="2024-01-01T00:00:00Z">
         <w:r>
           <w:t xml:space="preserve">.</w:t>
         </w:r>

</xml_diff>